<commit_message>
Secciones 2 y 4: validacion de ciclo de vida + fix filtro de fecha del Kanban
- Seccion 2: valida transiciones de estado (DETECTADA -> EN_ANALISIS -> RESUELTA,
  con retroceso y reapertura). Rechaza saltos invalidos con 409 (ConflictException).
- Seccion 4: el filtro de fecha del Kanban arranca vacio en vez de con la fecha
  de hoy, mostrando todas las vulnerabilidades desde el primer momento.
- Actualiza el registro de avance con el detalle de ambas secciones.
</commit_message>
<xml_diff>
--- a/docs/GEF_Secure_Registro_de_Avance.docx
+++ b/docs/GEF_Secure_Registro_de_Avance.docx
@@ -19,20 +19,8 @@
           <w:sz w:val="56"/>
           <w:szCs w:val="56"/>
         </w:rPr>
-        <w:t xml:space="preserve">GEF </w:t>
-      </w:r>
-      <w:proofErr w:type="spellStart"/>
-      <w:r>
-        <w:rPr>
-          <w:b/>
-          <w:bCs/>
-          <w:color w:val="4F46E5"/>
-          <w:sz w:val="56"/>
-          <w:szCs w:val="56"/>
-        </w:rPr>
-        <w:t>Secure</w:t>
-      </w:r>
-      <w:proofErr w:type="spellEnd"/>
+        <w:t xml:space="preserve">GEF Secure</w:t>
+      </w:r>
     </w:p>
     <w:p>
       <w:pPr>
@@ -71,27 +59,7 @@
         <w:rPr>
           <w:color w:val="334155"/>
         </w:rPr>
-        <w:t>Equipo: Guadalupe Maricchiolo · Emilia Barros</w:t>
-      </w:r>
-      <w:r>
-        <w:rPr>
-          <w:color w:val="334155"/>
-        </w:rPr>
-        <w:t xml:space="preserve"> · Federico </w:t>
-      </w:r>
-      <w:proofErr w:type="spellStart"/>
-      <w:r>
-        <w:rPr>
-          <w:color w:val="334155"/>
-        </w:rPr>
-        <w:t>Frankenberger</w:t>
-      </w:r>
-      <w:proofErr w:type="spellEnd"/>
-      <w:r>
-        <w:rPr>
-          <w:color w:val="334155"/>
-        </w:rPr>
-        <w:t xml:space="preserve"> (GEF)</w:t>
+        <w:t xml:space="preserve">Equipo: Guadalupe Maricchiolo · Emilia Barros · Federico Frankenberger (GEF)</w:t>
       </w:r>
     </w:p>
     <w:p>
@@ -545,23 +513,7 @@
           <w:sz w:val="19"/>
           <w:szCs w:val="19"/>
         </w:rPr>
-        <w:t xml:space="preserve">Se implementó el cálculo real de MTTR (tiempo entre detección y resolución efectiva) y se mostró como tarjeta nueva en el </w:t>
-      </w:r>
-      <w:proofErr w:type="spellStart"/>
-      <w:r>
-        <w:rPr>
-          <w:sz w:val="19"/>
-          <w:szCs w:val="19"/>
-        </w:rPr>
-        <w:t>Dashboard</w:t>
-      </w:r>
-      <w:proofErr w:type="spellEnd"/>
-      <w:r>
-        <w:rPr>
-          <w:sz w:val="19"/>
-          <w:szCs w:val="19"/>
-        </w:rPr>
-        <w:t>, reemplazando la ausencia total de esta métrica que señaló el tribunal.</w:t>
+        <w:t xml:space="preserve">Se implementó el cálculo real de MTTR (tiempo entre detección y resolución efectiva) y se mostró como tarjeta nueva en el Dashboard, reemplazando la ausencia total de esta métrica que señaló el tribunal.</w:t>
       </w:r>
     </w:p>
     <w:p>
@@ -597,17 +549,7 @@
           <w:szCs w:val="18"/>
           <w:lang w:val="en-US"/>
         </w:rPr>
-        <w:t>backend/src/main/java/com/gef/g</w:t>
-      </w:r>
-      <w:r>
-        <w:rPr>
-          <w:rFonts w:ascii="Consolas" w:eastAsia="Consolas" w:hAnsi="Consolas" w:cs="Consolas"/>
-          <w:color w:val="475569"/>
-          <w:sz w:val="18"/>
-          <w:szCs w:val="18"/>
-          <w:lang w:val="en-US"/>
-        </w:rPr>
-        <w:t>efsecureapp/repository/VulnerabilityAuditRepository.java</w:t>
+        <w:t>backend/src/main/java/com/gef/gefsecureapp/repository/VulnerabilityAuditRepository.java</w:t>
       </w:r>
     </w:p>
     <w:p>
@@ -665,7 +607,6 @@
         </w:numPr>
         <w:spacing w:after="40"/>
       </w:pPr>
-      <w:proofErr w:type="spellStart"/>
       <w:r>
         <w:rPr>
           <w:rFonts w:ascii="Consolas" w:eastAsia="Consolas" w:hAnsi="Consolas" w:cs="Consolas"/>
@@ -673,69 +614,8 @@
           <w:sz w:val="18"/>
           <w:szCs w:val="18"/>
         </w:rPr>
-        <w:t>frontend</w:t>
-      </w:r>
-      <w:proofErr w:type="spellEnd"/>
-      <w:r>
-        <w:rPr>
-          <w:rFonts w:ascii="Consolas" w:eastAsia="Consolas" w:hAnsi="Consolas" w:cs="Consolas"/>
-          <w:color w:val="475569"/>
-          <w:sz w:val="18"/>
-          <w:szCs w:val="18"/>
-        </w:rPr>
-        <w:t>/</w:t>
-      </w:r>
-      <w:proofErr w:type="spellStart"/>
-      <w:r>
-        <w:rPr>
-          <w:rFonts w:ascii="Consolas" w:eastAsia="Consolas" w:hAnsi="Consolas" w:cs="Consolas"/>
-          <w:color w:val="475569"/>
-          <w:sz w:val="18"/>
-          <w:szCs w:val="18"/>
-        </w:rPr>
-        <w:t>src</w:t>
-      </w:r>
-      <w:proofErr w:type="spellEnd"/>
-      <w:r>
-        <w:rPr>
-          <w:rFonts w:ascii="Consolas" w:eastAsia="Consolas" w:hAnsi="Consolas" w:cs="Consolas"/>
-          <w:color w:val="475569"/>
-          <w:sz w:val="18"/>
-          <w:szCs w:val="18"/>
-        </w:rPr>
-        <w:t>/</w:t>
-      </w:r>
-      <w:proofErr w:type="spellStart"/>
-      <w:r>
-        <w:rPr>
-          <w:rFonts w:ascii="Consolas" w:eastAsia="Consolas" w:hAnsi="Consolas" w:cs="Consolas"/>
-          <w:color w:val="475569"/>
-          <w:sz w:val="18"/>
-          <w:szCs w:val="18"/>
-        </w:rPr>
-        <w:t>types</w:t>
-      </w:r>
-      <w:proofErr w:type="spellEnd"/>
-      <w:r>
-        <w:rPr>
-          <w:rFonts w:ascii="Consolas" w:eastAsia="Consolas" w:hAnsi="Consolas" w:cs="Consolas"/>
-          <w:color w:val="475569"/>
-          <w:sz w:val="18"/>
-          <w:szCs w:val="18"/>
-        </w:rPr>
-        <w:t>/</w:t>
-      </w:r>
-      <w:proofErr w:type="spellStart"/>
-      <w:r>
-        <w:rPr>
-          <w:rFonts w:ascii="Consolas" w:eastAsia="Consolas" w:hAnsi="Consolas" w:cs="Consolas"/>
-          <w:color w:val="475569"/>
-          <w:sz w:val="18"/>
-          <w:szCs w:val="18"/>
-        </w:rPr>
-        <w:t>index.ts</w:t>
-      </w:r>
-      <w:proofErr w:type="spellEnd"/>
+        <w:t>frontend/src/types/index.ts</w:t>
+      </w:r>
     </w:p>
     <w:p>
       <w:pPr>
@@ -746,7 +626,6 @@
         </w:numPr>
         <w:spacing w:after="40"/>
       </w:pPr>
-      <w:proofErr w:type="spellStart"/>
       <w:r>
         <w:rPr>
           <w:rFonts w:ascii="Consolas" w:eastAsia="Consolas" w:hAnsi="Consolas" w:cs="Consolas"/>
@@ -754,69 +633,8 @@
           <w:sz w:val="18"/>
           <w:szCs w:val="18"/>
         </w:rPr>
-        <w:t>frontend</w:t>
-      </w:r>
-      <w:proofErr w:type="spellEnd"/>
-      <w:r>
-        <w:rPr>
-          <w:rFonts w:ascii="Consolas" w:eastAsia="Consolas" w:hAnsi="Consolas" w:cs="Consolas"/>
-          <w:color w:val="475569"/>
-          <w:sz w:val="18"/>
-          <w:szCs w:val="18"/>
-        </w:rPr>
-        <w:t>/</w:t>
-      </w:r>
-      <w:proofErr w:type="spellStart"/>
-      <w:r>
-        <w:rPr>
-          <w:rFonts w:ascii="Consolas" w:eastAsia="Consolas" w:hAnsi="Consolas" w:cs="Consolas"/>
-          <w:color w:val="475569"/>
-          <w:sz w:val="18"/>
-          <w:szCs w:val="18"/>
-        </w:rPr>
-        <w:t>src</w:t>
-      </w:r>
-      <w:proofErr w:type="spellEnd"/>
-      <w:r>
-        <w:rPr>
-          <w:rFonts w:ascii="Consolas" w:eastAsia="Consolas" w:hAnsi="Consolas" w:cs="Consolas"/>
-          <w:color w:val="475569"/>
-          <w:sz w:val="18"/>
-          <w:szCs w:val="18"/>
-        </w:rPr>
-        <w:t>/</w:t>
-      </w:r>
-      <w:proofErr w:type="spellStart"/>
-      <w:r>
-        <w:rPr>
-          <w:rFonts w:ascii="Consolas" w:eastAsia="Consolas" w:hAnsi="Consolas" w:cs="Consolas"/>
-          <w:color w:val="475569"/>
-          <w:sz w:val="18"/>
-          <w:szCs w:val="18"/>
-        </w:rPr>
-        <w:t>pages</w:t>
-      </w:r>
-      <w:proofErr w:type="spellEnd"/>
-      <w:r>
-        <w:rPr>
-          <w:rFonts w:ascii="Consolas" w:eastAsia="Consolas" w:hAnsi="Consolas" w:cs="Consolas"/>
-          <w:color w:val="475569"/>
-          <w:sz w:val="18"/>
-          <w:szCs w:val="18"/>
-        </w:rPr>
-        <w:t>/</w:t>
-      </w:r>
-      <w:proofErr w:type="spellStart"/>
-      <w:r>
-        <w:rPr>
-          <w:rFonts w:ascii="Consolas" w:eastAsia="Consolas" w:hAnsi="Consolas" w:cs="Consolas"/>
-          <w:color w:val="475569"/>
-          <w:sz w:val="18"/>
-          <w:szCs w:val="18"/>
-        </w:rPr>
-        <w:t>Dashboard.tsx</w:t>
-      </w:r>
-      <w:proofErr w:type="spellEnd"/>
+        <w:t>frontend/src/pages/Dashboard.tsx</w:t>
+      </w:r>
     </w:p>
     <w:p>
       <w:pPr>
@@ -845,55 +663,7 @@
           <w:sz w:val="19"/>
           <w:szCs w:val="19"/>
         </w:rPr>
-        <w:t xml:space="preserve">Se aprovecharon las columnas </w:t>
-      </w:r>
-      <w:proofErr w:type="spellStart"/>
-      <w:r>
-        <w:rPr>
-          <w:sz w:val="19"/>
-          <w:szCs w:val="19"/>
-        </w:rPr>
-        <w:t>detected_at</w:t>
-      </w:r>
-      <w:proofErr w:type="spellEnd"/>
-      <w:r>
-        <w:rPr>
-          <w:sz w:val="19"/>
-          <w:szCs w:val="19"/>
-        </w:rPr>
-        <w:t xml:space="preserve"> y </w:t>
-      </w:r>
-      <w:proofErr w:type="spellStart"/>
-      <w:r>
-        <w:rPr>
-          <w:sz w:val="19"/>
-          <w:szCs w:val="19"/>
-        </w:rPr>
-        <w:t>resolved_at</w:t>
-      </w:r>
-      <w:proofErr w:type="spellEnd"/>
-      <w:r>
-        <w:rPr>
-          <w:sz w:val="19"/>
-          <w:szCs w:val="19"/>
-        </w:rPr>
-        <w:t xml:space="preserve"> ya existentes en </w:t>
-      </w:r>
-      <w:proofErr w:type="spellStart"/>
-      <w:r>
-        <w:rPr>
-          <w:sz w:val="19"/>
-          <w:szCs w:val="19"/>
-        </w:rPr>
-        <w:t>vulnerabilities_audit</w:t>
-      </w:r>
-      <w:proofErr w:type="spellEnd"/>
-      <w:r>
-        <w:rPr>
-          <w:sz w:val="19"/>
-          <w:szCs w:val="19"/>
-        </w:rPr>
-        <w:t xml:space="preserve"> — no fue necesario migrar el esquema de la base de datos.</w:t>
+        <w:t xml:space="preserve">Se aprovecharon las columnas detected_at y resolved_at ya existentes en vulnerabilities_audit — no fue necesario migrar el esquema de la base de datos.</w:t>
       </w:r>
     </w:p>
     <w:p>
@@ -905,110 +675,12 @@
         </w:numPr>
         <w:spacing w:after="60"/>
       </w:pPr>
-      <w:proofErr w:type="spellStart"/>
-      <w:r>
-        <w:rPr>
-          <w:sz w:val="19"/>
-          <w:szCs w:val="19"/>
-        </w:rPr>
-        <w:t>Repository</w:t>
-      </w:r>
-      <w:proofErr w:type="spellEnd"/>
-      <w:r>
-        <w:rPr>
-          <w:sz w:val="19"/>
-          <w:szCs w:val="19"/>
-        </w:rPr>
-        <w:t xml:space="preserve">: se agregó el método </w:t>
-      </w:r>
-      <w:proofErr w:type="spellStart"/>
-      <w:proofErr w:type="gramStart"/>
-      <w:r>
-        <w:rPr>
-          <w:sz w:val="19"/>
-          <w:szCs w:val="19"/>
-        </w:rPr>
-        <w:t>findAverageMttrDays</w:t>
-      </w:r>
-      <w:proofErr w:type="spellEnd"/>
-      <w:r>
-        <w:rPr>
-          <w:sz w:val="19"/>
-          <w:szCs w:val="19"/>
-        </w:rPr>
-        <w:t>(</w:t>
-      </w:r>
-      <w:proofErr w:type="gramEnd"/>
-      <w:r>
-        <w:rPr>
-          <w:sz w:val="19"/>
-          <w:szCs w:val="19"/>
-        </w:rPr>
-        <w:t xml:space="preserve">), una </w:t>
-      </w:r>
-      <w:proofErr w:type="spellStart"/>
-      <w:r>
-        <w:rPr>
-          <w:sz w:val="19"/>
-          <w:szCs w:val="19"/>
-        </w:rPr>
-        <w:t>query</w:t>
-      </w:r>
-      <w:proofErr w:type="spellEnd"/>
-      <w:r>
-        <w:rPr>
-          <w:sz w:val="19"/>
-          <w:szCs w:val="19"/>
-        </w:rPr>
-        <w:t xml:space="preserve"> nativa que calcula AVG(EXTRACT(EPOCH FROM (</w:t>
-      </w:r>
-      <w:proofErr w:type="spellStart"/>
-      <w:r>
-        <w:rPr>
-          <w:sz w:val="19"/>
-          <w:szCs w:val="19"/>
-        </w:rPr>
-        <w:t>resolved_at</w:t>
-      </w:r>
-      <w:proofErr w:type="spellEnd"/>
-      <w:r>
-        <w:rPr>
-          <w:sz w:val="19"/>
-          <w:szCs w:val="19"/>
-        </w:rPr>
-        <w:t xml:space="preserve"> - </w:t>
-      </w:r>
-      <w:proofErr w:type="spellStart"/>
-      <w:r>
-        <w:rPr>
-          <w:sz w:val="19"/>
-          <w:szCs w:val="19"/>
-        </w:rPr>
-        <w:t>detected_at</w:t>
-      </w:r>
-      <w:proofErr w:type="spellEnd"/>
-      <w:r>
-        <w:rPr>
-          <w:sz w:val="19"/>
-          <w:szCs w:val="19"/>
-        </w:rPr>
-        <w:t xml:space="preserve">)) / 86400.0) sobre las filas con </w:t>
-      </w:r>
-      <w:proofErr w:type="spellStart"/>
-      <w:r>
-        <w:rPr>
-          <w:sz w:val="19"/>
-          <w:szCs w:val="19"/>
-        </w:rPr>
-        <w:t>resolved_at</w:t>
-      </w:r>
-      <w:proofErr w:type="spellEnd"/>
-      <w:r>
-        <w:rPr>
-          <w:sz w:val="19"/>
-          <w:szCs w:val="19"/>
-        </w:rPr>
-        <w:t xml:space="preserve"> no nulo, devolviendo el promedio en días.</w:t>
+      <w:r>
+        <w:rPr>
+          <w:sz w:val="19"/>
+          <w:szCs w:val="19"/>
+        </w:rPr>
+        <w:t xml:space="preserve">Repository: se agregó el método findAverageMttrDays(), una query nativa que calcula AVG(EXTRACT(EPOCH FROM (resolved_at - detected_at)) / 86400.0) sobre las filas con resolved_at no nulo, devolviendo el promedio en días.</w:t>
       </w:r>
     </w:p>
     <w:p>
@@ -1025,62 +697,7 @@
           <w:sz w:val="19"/>
           <w:szCs w:val="19"/>
         </w:rPr>
-        <w:t xml:space="preserve">DTO: se agregó el campo </w:t>
-      </w:r>
-      <w:proofErr w:type="spellStart"/>
-      <w:r>
-        <w:rPr>
-          <w:sz w:val="19"/>
-          <w:szCs w:val="19"/>
-        </w:rPr>
-        <w:t>mttrDays</w:t>
-      </w:r>
-      <w:proofErr w:type="spellEnd"/>
-      <w:r>
-        <w:rPr>
-          <w:sz w:val="19"/>
-          <w:szCs w:val="19"/>
-        </w:rPr>
-        <w:t xml:space="preserve"> (</w:t>
-      </w:r>
-      <w:proofErr w:type="spellStart"/>
-      <w:r>
-        <w:rPr>
-          <w:sz w:val="19"/>
-          <w:szCs w:val="19"/>
-        </w:rPr>
-        <w:t>D</w:t>
-      </w:r>
-      <w:r>
-        <w:rPr>
-          <w:sz w:val="19"/>
-          <w:szCs w:val="19"/>
-        </w:rPr>
-        <w:t>ouble</w:t>
-      </w:r>
-      <w:proofErr w:type="spellEnd"/>
-      <w:r>
-        <w:rPr>
-          <w:sz w:val="19"/>
-          <w:szCs w:val="19"/>
-        </w:rPr>
-        <w:t xml:space="preserve">) a </w:t>
-      </w:r>
-      <w:proofErr w:type="spellStart"/>
-      <w:r>
-        <w:rPr>
-          <w:sz w:val="19"/>
-          <w:szCs w:val="19"/>
-        </w:rPr>
-        <w:t>DashboardStatsDTO</w:t>
-      </w:r>
-      <w:proofErr w:type="spellEnd"/>
-      <w:r>
-        <w:rPr>
-          <w:sz w:val="19"/>
-          <w:szCs w:val="19"/>
-        </w:rPr>
-        <w:t>.</w:t>
+        <w:t xml:space="preserve">DTO: se agregó el campo mttrDays (Double) a DashboardStatsDTO.</w:t>
       </w:r>
     </w:p>
     <w:p>
@@ -1092,69 +709,12 @@
         </w:numPr>
         <w:spacing w:after="60"/>
       </w:pPr>
-      <w:proofErr w:type="spellStart"/>
-      <w:r>
-        <w:rPr>
-          <w:sz w:val="19"/>
-          <w:szCs w:val="19"/>
-        </w:rPr>
-        <w:t>Service</w:t>
-      </w:r>
-      <w:proofErr w:type="spellEnd"/>
-      <w:r>
-        <w:rPr>
-          <w:sz w:val="19"/>
-          <w:szCs w:val="19"/>
-        </w:rPr>
-        <w:t xml:space="preserve">: </w:t>
-      </w:r>
-      <w:proofErr w:type="spellStart"/>
-      <w:r>
-        <w:rPr>
-          <w:sz w:val="19"/>
-          <w:szCs w:val="19"/>
-        </w:rPr>
-        <w:t>DashboardService.getStats</w:t>
-      </w:r>
-      <w:proofErr w:type="spellEnd"/>
-      <w:r>
-        <w:rPr>
-          <w:sz w:val="19"/>
-          <w:szCs w:val="19"/>
-        </w:rPr>
-        <w:t xml:space="preserve">() llama al nuevo método del </w:t>
-      </w:r>
-      <w:proofErr w:type="spellStart"/>
-      <w:r>
-        <w:rPr>
-          <w:sz w:val="19"/>
-          <w:szCs w:val="19"/>
-        </w:rPr>
-        <w:t>repository</w:t>
-      </w:r>
-      <w:proofErr w:type="spellEnd"/>
-      <w:r>
-        <w:rPr>
-          <w:sz w:val="19"/>
-          <w:szCs w:val="19"/>
-        </w:rPr>
-        <w:t xml:space="preserve"> y lo agrega al </w:t>
-      </w:r>
-      <w:proofErr w:type="spellStart"/>
-      <w:r>
-        <w:rPr>
-          <w:sz w:val="19"/>
-          <w:szCs w:val="19"/>
-        </w:rPr>
-        <w:t>builder</w:t>
-      </w:r>
-      <w:proofErr w:type="spellEnd"/>
-      <w:r>
-        <w:rPr>
-          <w:sz w:val="19"/>
-          <w:szCs w:val="19"/>
-        </w:rPr>
-        <w:t xml:space="preserve"> del DTO de respuesta.</w:t>
+      <w:r>
+        <w:rPr>
+          <w:sz w:val="19"/>
+          <w:szCs w:val="19"/>
+        </w:rPr>
+        <w:t xml:space="preserve">Service: DashboardService.getStats() llama al nuevo método del repository y lo agrega al builder del DTO de respuesta.</w:t>
       </w:r>
     </w:p>
     <w:p>
@@ -1175,79 +735,7 @@
           <w:szCs w:val="19"/>
           <w:lang w:val="en-US"/>
         </w:rPr>
-        <w:t xml:space="preserve">Frontend: se </w:t>
-      </w:r>
-      <w:proofErr w:type="spellStart"/>
-      <w:r>
-        <w:rPr>
-          <w:sz w:val="19"/>
-          <w:szCs w:val="19"/>
-          <w:lang w:val="en-US"/>
-        </w:rPr>
-        <w:t>agregó</w:t>
-      </w:r>
-      <w:proofErr w:type="spellEnd"/>
-      <w:r>
-        <w:rPr>
-          <w:sz w:val="19"/>
-          <w:szCs w:val="19"/>
-          <w:lang w:val="en-US"/>
-        </w:rPr>
-        <w:t xml:space="preserve"> </w:t>
-      </w:r>
-      <w:proofErr w:type="spellStart"/>
-      <w:r>
-        <w:rPr>
-          <w:sz w:val="19"/>
-          <w:szCs w:val="19"/>
-          <w:lang w:val="en-US"/>
-        </w:rPr>
-        <w:t>mttrDays</w:t>
-      </w:r>
-      <w:proofErr w:type="spellEnd"/>
-      <w:r>
-        <w:rPr>
-          <w:sz w:val="19"/>
-          <w:szCs w:val="19"/>
-          <w:lang w:val="en-US"/>
-        </w:rPr>
-        <w:t xml:space="preserve"> (number | null) al </w:t>
-      </w:r>
-      <w:proofErr w:type="spellStart"/>
-      <w:r>
-        <w:rPr>
-          <w:sz w:val="19"/>
-          <w:szCs w:val="19"/>
-          <w:lang w:val="en-US"/>
-        </w:rPr>
-        <w:t>tipo</w:t>
-      </w:r>
-      <w:proofErr w:type="spellEnd"/>
-      <w:r>
-        <w:rPr>
-          <w:sz w:val="19"/>
-          <w:szCs w:val="19"/>
-          <w:lang w:val="en-US"/>
-        </w:rPr>
-        <w:t xml:space="preserve"> </w:t>
-      </w:r>
-      <w:proofErr w:type="spellStart"/>
-      <w:r>
-        <w:rPr>
-          <w:sz w:val="19"/>
-          <w:szCs w:val="19"/>
-          <w:lang w:val="en-US"/>
-        </w:rPr>
-        <w:t>DashboardStats</w:t>
-      </w:r>
-      <w:proofErr w:type="spellEnd"/>
-      <w:r>
-        <w:rPr>
-          <w:sz w:val="19"/>
-          <w:szCs w:val="19"/>
-          <w:lang w:val="en-US"/>
-        </w:rPr>
-        <w:t>.</w:t>
+        <w:t xml:space="preserve">Frontend: se agregó mttrDays (number | null) al tipo DashboardStats.</w:t>
       </w:r>
     </w:p>
     <w:p>
@@ -1259,69 +747,12 @@
         </w:numPr>
         <w:spacing w:after="60"/>
       </w:pPr>
-      <w:proofErr w:type="spellStart"/>
-      <w:r>
-        <w:rPr>
-          <w:sz w:val="19"/>
-          <w:szCs w:val="19"/>
-        </w:rPr>
-        <w:t>Frontend</w:t>
-      </w:r>
-      <w:proofErr w:type="spellEnd"/>
-      <w:r>
-        <w:rPr>
-          <w:sz w:val="19"/>
-          <w:szCs w:val="19"/>
-        </w:rPr>
-        <w:t xml:space="preserve">: se agregó la función </w:t>
-      </w:r>
-      <w:proofErr w:type="spellStart"/>
-      <w:proofErr w:type="gramStart"/>
-      <w:r>
-        <w:rPr>
-          <w:sz w:val="19"/>
-          <w:szCs w:val="19"/>
-        </w:rPr>
-        <w:t>formatMtt</w:t>
-      </w:r>
-      <w:r>
-        <w:rPr>
-          <w:sz w:val="19"/>
-          <w:szCs w:val="19"/>
-        </w:rPr>
-        <w:t>r</w:t>
-      </w:r>
-      <w:proofErr w:type="spellEnd"/>
-      <w:r>
-        <w:rPr>
-          <w:sz w:val="19"/>
-          <w:szCs w:val="19"/>
-        </w:rPr>
-        <w:t>(</w:t>
-      </w:r>
-      <w:proofErr w:type="gramEnd"/>
-      <w:r>
-        <w:rPr>
-          <w:sz w:val="19"/>
-          <w:szCs w:val="19"/>
-        </w:rPr>
-        <w:t xml:space="preserve">) en </w:t>
-      </w:r>
-      <w:proofErr w:type="spellStart"/>
-      <w:r>
-        <w:rPr>
-          <w:sz w:val="19"/>
-          <w:szCs w:val="19"/>
-        </w:rPr>
-        <w:t>Dashboard.tsx</w:t>
-      </w:r>
-      <w:proofErr w:type="spellEnd"/>
-      <w:r>
-        <w:rPr>
-          <w:sz w:val="19"/>
-          <w:szCs w:val="19"/>
-        </w:rPr>
-        <w:t>, que muestra el valor en horas si es menor a 1 día, en días con un decimal si es mayor, y un guion (—) si todavía no hay ninguna vulnerabilidad resuelta.</w:t>
+      <w:r>
+        <w:rPr>
+          <w:sz w:val="19"/>
+          <w:szCs w:val="19"/>
+        </w:rPr>
+        <w:t xml:space="preserve">Frontend: se agregó la función formatMttr() en Dashboard.tsx, que muestra el valor en horas si es menor a 1 día, en días con un decimal si es mayor, y un guion (—) si todavía no hay ninguna vulnerabilidad resuelta.</w:t>
       </w:r>
     </w:p>
     <w:p>
@@ -1333,109 +764,13 @@
         </w:numPr>
         <w:spacing w:after="60"/>
       </w:pPr>
-      <w:proofErr w:type="spellStart"/>
       <w:r>
         <w:rPr>
           <w:sz w:val="19"/>
           <w:szCs w:val="19"/>
         </w:rPr>
         <w:lastRenderedPageBreak/>
-        <w:t>Frontend</w:t>
-      </w:r>
-      <w:proofErr w:type="spellEnd"/>
-      <w:r>
-        <w:rPr>
-          <w:sz w:val="19"/>
-          <w:szCs w:val="19"/>
-        </w:rPr>
-        <w:t xml:space="preserve">: se agregó la tarjeta “MTTR” al </w:t>
-      </w:r>
-      <w:proofErr w:type="spellStart"/>
-      <w:r>
-        <w:rPr>
-          <w:sz w:val="19"/>
-          <w:szCs w:val="19"/>
-        </w:rPr>
-        <w:t>array</w:t>
-      </w:r>
-      <w:proofErr w:type="spellEnd"/>
-      <w:r>
-        <w:rPr>
-          <w:sz w:val="19"/>
-          <w:szCs w:val="19"/>
-        </w:rPr>
-        <w:t xml:space="preserve"> de </w:t>
-      </w:r>
-      <w:proofErr w:type="spellStart"/>
-      <w:r>
-        <w:rPr>
-          <w:sz w:val="19"/>
-          <w:szCs w:val="19"/>
-        </w:rPr>
-        <w:t>KPIs</w:t>
-      </w:r>
-      <w:proofErr w:type="spellEnd"/>
-      <w:r>
-        <w:rPr>
-          <w:sz w:val="19"/>
-          <w:szCs w:val="19"/>
-        </w:rPr>
-        <w:t xml:space="preserve"> del </w:t>
-      </w:r>
-      <w:proofErr w:type="spellStart"/>
-      <w:r>
-        <w:rPr>
-          <w:sz w:val="19"/>
-          <w:szCs w:val="19"/>
-        </w:rPr>
-        <w:t>Dashboard</w:t>
-      </w:r>
-      <w:proofErr w:type="spellEnd"/>
-      <w:r>
-        <w:rPr>
-          <w:sz w:val="19"/>
-          <w:szCs w:val="19"/>
-        </w:rPr>
-        <w:t xml:space="preserve">, con ícono </w:t>
-      </w:r>
-      <w:proofErr w:type="spellStart"/>
-      <w:r>
-        <w:rPr>
-          <w:sz w:val="19"/>
-          <w:szCs w:val="19"/>
-        </w:rPr>
-        <w:t>C</w:t>
-      </w:r>
-      <w:r>
-        <w:rPr>
-          <w:sz w:val="19"/>
-          <w:szCs w:val="19"/>
-        </w:rPr>
-        <w:t>lock</w:t>
-      </w:r>
-      <w:proofErr w:type="spellEnd"/>
-      <w:r>
-        <w:rPr>
-          <w:sz w:val="19"/>
-          <w:szCs w:val="19"/>
-        </w:rPr>
-        <w:t xml:space="preserve"> (</w:t>
-      </w:r>
-      <w:proofErr w:type="spellStart"/>
-      <w:r>
-        <w:rPr>
-          <w:sz w:val="19"/>
-          <w:szCs w:val="19"/>
-        </w:rPr>
-        <w:t>lucide-react</w:t>
-      </w:r>
-      <w:proofErr w:type="spellEnd"/>
-      <w:r>
-        <w:rPr>
-          <w:sz w:val="19"/>
-          <w:szCs w:val="19"/>
-        </w:rPr>
-        <w:t>), entre “Resueltas este mes” y “Estado del sistema”.</w:t>
+        <w:t xml:space="preserve">Frontend: se agregó la tarjeta “MTTR” al array de KPIs del Dashboard, con ícono Clock (lucide-react), entre “Resueltas este mes” y “Estado del sistema”.</w:t>
       </w:r>
     </w:p>
     <w:p>
@@ -1460,142 +795,7 @@
           <w:sz w:val="19"/>
           <w:szCs w:val="19"/>
         </w:rPr>
-        <w:t>Probado en ambiente local (</w:t>
-      </w:r>
-      <w:proofErr w:type="spellStart"/>
-      <w:r>
-        <w:rPr>
-          <w:sz w:val="19"/>
-          <w:szCs w:val="19"/>
-        </w:rPr>
-        <w:t>Docker</w:t>
-      </w:r>
-      <w:proofErr w:type="spellEnd"/>
-      <w:r>
-        <w:rPr>
-          <w:sz w:val="19"/>
-          <w:szCs w:val="19"/>
-        </w:rPr>
-        <w:t xml:space="preserve"> </w:t>
-      </w:r>
-      <w:proofErr w:type="spellStart"/>
-      <w:r>
-        <w:rPr>
-          <w:sz w:val="19"/>
-          <w:szCs w:val="19"/>
-        </w:rPr>
-        <w:t>Compose</w:t>
-      </w:r>
-      <w:proofErr w:type="spellEnd"/>
-      <w:r>
-        <w:rPr>
-          <w:sz w:val="19"/>
-          <w:szCs w:val="19"/>
-        </w:rPr>
-        <w:t xml:space="preserve">): tras reconstruir </w:t>
-      </w:r>
-      <w:proofErr w:type="spellStart"/>
-      <w:r>
-        <w:rPr>
-          <w:sz w:val="19"/>
-          <w:szCs w:val="19"/>
-        </w:rPr>
-        <w:t>backend</w:t>
-      </w:r>
-      <w:proofErr w:type="spellEnd"/>
-      <w:r>
-        <w:rPr>
-          <w:sz w:val="19"/>
-          <w:szCs w:val="19"/>
-        </w:rPr>
-        <w:t xml:space="preserve"> y </w:t>
-      </w:r>
-      <w:proofErr w:type="spellStart"/>
-      <w:r>
-        <w:rPr>
-          <w:sz w:val="19"/>
-          <w:szCs w:val="19"/>
-        </w:rPr>
-        <w:t>frontend</w:t>
-      </w:r>
-      <w:proofErr w:type="spellEnd"/>
-      <w:r>
-        <w:rPr>
-          <w:sz w:val="19"/>
-          <w:szCs w:val="19"/>
-        </w:rPr>
-        <w:t>, la tarjeta MTTR mostró 4.0 d, calculado correctamente sobre las 4 vulnerabilidades resuelt</w:t>
-      </w:r>
-      <w:r>
-        <w:rPr>
-          <w:sz w:val="19"/>
-          <w:szCs w:val="19"/>
-        </w:rPr>
-        <w:t xml:space="preserve">as de los datos de ejemplo (diferencias de 5, 3, 1 y 7 días → promedio 4.0). Cambios </w:t>
-      </w:r>
-      <w:proofErr w:type="spellStart"/>
-      <w:r>
-        <w:rPr>
-          <w:sz w:val="19"/>
-          <w:szCs w:val="19"/>
-        </w:rPr>
-        <w:t>commiteados</w:t>
-      </w:r>
-      <w:proofErr w:type="spellEnd"/>
-      <w:r>
-        <w:rPr>
-          <w:sz w:val="19"/>
-          <w:szCs w:val="19"/>
-        </w:rPr>
-        <w:t xml:space="preserve"> y subidos a </w:t>
-      </w:r>
-      <w:proofErr w:type="spellStart"/>
-      <w:r>
-        <w:rPr>
-          <w:sz w:val="19"/>
-          <w:szCs w:val="19"/>
-        </w:rPr>
-        <w:t>origin</w:t>
-      </w:r>
-      <w:proofErr w:type="spellEnd"/>
-      <w:r>
-        <w:rPr>
-          <w:sz w:val="19"/>
-          <w:szCs w:val="19"/>
-        </w:rPr>
-        <w:t>/</w:t>
-      </w:r>
-      <w:proofErr w:type="spellStart"/>
-      <w:r>
-        <w:rPr>
-          <w:sz w:val="19"/>
-          <w:szCs w:val="19"/>
-        </w:rPr>
-        <w:t>main</w:t>
-      </w:r>
-      <w:proofErr w:type="spellEnd"/>
-      <w:r>
-        <w:rPr>
-          <w:sz w:val="19"/>
-          <w:szCs w:val="19"/>
-        </w:rPr>
-        <w:t xml:space="preserve"> (</w:t>
-      </w:r>
-      <w:proofErr w:type="spellStart"/>
-      <w:r>
-        <w:rPr>
-          <w:sz w:val="19"/>
-          <w:szCs w:val="19"/>
-        </w:rPr>
-        <w:t>commit</w:t>
-      </w:r>
-      <w:proofErr w:type="spellEnd"/>
-      <w:r>
-        <w:rPr>
-          <w:sz w:val="19"/>
-          <w:szCs w:val="19"/>
-        </w:rPr>
-        <w:t xml:space="preserve"> a1b664d).</w:t>
+        <w:t xml:space="preserve">Probado en ambiente local (Docker Compose): tras reconstruir backend y frontend, la tarjeta MTTR mostró 4.0 d, calculado correctamente sobre las 4 vulnerabilidades resueltas de los datos de ejemplo (diferencias de 5, 3, 1 y 7 días → promedio 4.0). Cambios commiteados y subidos a origin/main (commit a1b664d).</w:t>
       </w:r>
     </w:p>
     <w:p>
@@ -1620,21 +820,7 @@
           <w:sz w:val="19"/>
           <w:szCs w:val="19"/>
         </w:rPr>
-        <w:t>El dictamen del tribunal marca como requisito previo que el ciclo de vida de estados esté v</w:t>
-      </w:r>
-      <w:r>
-        <w:rPr>
-          <w:sz w:val="19"/>
-          <w:szCs w:val="19"/>
-        </w:rPr>
-        <w:t>alidado (Sección 2) para que el promedio de MTTR sea confiable — hoy una vulnerabilidad puede saltar directo de “Detectada” a “Resuelta” sin pasar por “En análisis”, lo cual puede distorsionar el cálculo. El cálculo implementado hoy seguirá funcionando igu</w:t>
-      </w:r>
-      <w:r>
-        <w:rPr>
-          <w:sz w:val="19"/>
-          <w:szCs w:val="19"/>
-        </w:rPr>
-        <w:t>al una vez resuelta la Sección 2, solo que sobre datos más confiables.</w:t>
+        <w:t>El dictamen del tribunal marca como requisito previo que el ciclo de vida de estados esté validado (Sección 2) para que el promedio de MTTR sea confiable — hoy una vulnerabilidad puede saltar directo de “Detectada” a “Resuelta” sin pasar por “En análisis”, lo cual puede distorsionar el cálculo. El cálculo implementado hoy seguirá funcionando igual una vez resuelta la Sección 2, solo que sobre datos más confiables.</w:t>
       </w:r>
       <w:bookmarkStart w:id="0" w:name="_GoBack"/>
       <w:bookmarkEnd w:id="0"/>
@@ -1730,7 +916,16 @@
               <w:right w:w="120" w:type="dxa"/>
             </w:tcMar>
           </w:tcPr>
-          <w:p/>
+          <w:p>
+            <w:r>
+              <w:rPr>
+                <w:color w:val="0F172A"/>
+                <w:sz w:val="19"/>
+                <w:szCs w:val="19"/>
+              </w:rPr>
+              <w:t>Emilia Barros</w:t>
+            </w:r>
+          </w:p>
         </w:tc>
         <w:tc>
           <w:tcPr>
@@ -1785,7 +980,7 @@
                 <w:sz w:val="19"/>
                 <w:szCs w:val="19"/>
               </w:rPr>
-              <w:t>PENDIENTE</w:t>
+              <w:t>FINALIZADO</w:t>
             </w:r>
           </w:p>
         </w:tc>
@@ -1793,7 +988,7 @@
     </w:tbl>
     <w:p>
       <w:pPr>
-        <w:spacing w:before="160" w:after="60"/>
+        <w:spacing w:before="120"/>
       </w:pPr>
       <w:r>
         <w:rPr>
@@ -1802,7 +997,226 @@
           <w:sz w:val="19"/>
           <w:szCs w:val="19"/>
         </w:rPr>
-        <w:t xml:space="preserve">Cambios realizados: </w:t>
+        <w:t xml:space="preserve">Fecha: </w:t>
+      </w:r>
+      <w:r>
+        <w:rPr>
+          <w:sz w:val="19"/>
+          <w:szCs w:val="19"/>
+        </w:rPr>
+        <w:t>04/08/2026</w:t>
+      </w:r>
+    </w:p>
+    <w:p>
+      <w:pPr>
+        <w:spacing w:before="200" w:after="80"/>
+      </w:pPr>
+      <w:r>
+        <w:rPr>
+          <w:b/>
+          <w:bCs/>
+          <w:color w:val="4F46E5"/>
+        </w:rPr>
+        <w:t>Resumen</w:t>
+      </w:r>
+    </w:p>
+    <w:p>
+      <w:pPr>
+        <w:spacing w:after="120"/>
+      </w:pPr>
+      <w:r>
+        <w:rPr>
+          <w:sz w:val="19"/>
+          <w:szCs w:val="19"/>
+        </w:rPr>
+        <w:t xml:space="preserve">Se agregó la validación de las transiciones de estado permitidas sobre una vulnerabilidad, rechazando cualquier cambio que no respete el ciclo DETECTADA → EN_ANALISIS → RESUELTA que señaló el tribunal como requisito bloqueante.</w:t>
+      </w:r>
+    </w:p>
+    <w:p>
+      <w:pPr>
+        <w:spacing w:before="200" w:after="80"/>
+      </w:pPr>
+      <w:r>
+        <w:rPr>
+          <w:b/>
+          <w:bCs/>
+          <w:color w:val="4F46E5"/>
+        </w:rPr>
+        <w:t>Archivos modificados</w:t>
+      </w:r>
+    </w:p>
+    <w:p>
+      <w:pPr>
+        <w:pStyle w:val="Prrafodelista"/>
+        <w:numPr>
+          <w:ilvl w:val="0"/>
+          <w:numId w:val="2"/>
+        </w:numPr>
+        <w:spacing w:after="40"/>
+      </w:pPr>
+      <w:r>
+        <w:rPr>
+          <w:rFonts w:ascii="Consolas" w:eastAsia="Consolas" w:hAnsi="Consolas" w:cs="Consolas"/>
+          <w:color w:val="475569"/>
+          <w:sz w:val="18"/>
+          <w:szCs w:val="18"/>
+        </w:rPr>
+        <w:t>backend/src/main/java/com/gef/gefsecureapp/service/VulnerabilityAuditService.java</w:t>
+      </w:r>
+    </w:p>
+    <w:p>
+      <w:pPr>
+        <w:pStyle w:val="Prrafodelista"/>
+        <w:numPr>
+          <w:ilvl w:val="0"/>
+          <w:numId w:val="2"/>
+        </w:numPr>
+        <w:spacing w:after="40"/>
+      </w:pPr>
+      <w:r>
+        <w:rPr>
+          <w:rFonts w:ascii="Consolas" w:eastAsia="Consolas" w:hAnsi="Consolas" w:cs="Consolas"/>
+          <w:color w:val="475569"/>
+          <w:sz w:val="18"/>
+          <w:szCs w:val="18"/>
+        </w:rPr>
+        <w:t>frontend/src/pages/Kanban.tsx</w:t>
+      </w:r>
+    </w:p>
+    <w:p>
+      <w:pPr>
+        <w:spacing w:before="200" w:after="80"/>
+      </w:pPr>
+      <w:r>
+        <w:rPr>
+          <w:b/>
+          <w:bCs/>
+          <w:color w:val="4F46E5"/>
+        </w:rPr>
+        <w:t>Cambios realizados</w:t>
+      </w:r>
+    </w:p>
+    <w:p>
+      <w:pPr>
+        <w:pStyle w:val="Prrafodelista"/>
+        <w:numPr>
+          <w:ilvl w:val="0"/>
+          <w:numId w:val="3"/>
+        </w:numPr>
+        <w:spacing w:after="60"/>
+      </w:pPr>
+      <w:r>
+        <w:rPr>
+          <w:sz w:val="19"/>
+          <w:szCs w:val="19"/>
+        </w:rPr>
+        <w:t xml:space="preserve">Se agregó un mapa TRANSICIONES_PERMITIDAS con el ciclo de vida válido: DETECTADA → EN_ANALISIS, EN_ANALISIS → DETECTADA o RESUELTA, RESUELTA → EN_ANALISIS.</w:t>
+      </w:r>
+    </w:p>
+    <w:p>
+      <w:pPr>
+        <w:pStyle w:val="Prrafodelista"/>
+        <w:numPr>
+          <w:ilvl w:val="0"/>
+          <w:numId w:val="3"/>
+        </w:numPr>
+        <w:spacing w:after="60"/>
+      </w:pPr>
+      <w:r>
+        <w:rPr>
+          <w:sz w:val="19"/>
+          <w:szCs w:val="19"/>
+        </w:rPr>
+        <w:t xml:space="preserve">VulnerabilityAuditService.updateStatus() valida la transición antes de guardar mediante un nuevo método validateTransition(); si el estado es desconocido o la transición no está permitida (por ejemplo DETECTADA → RESUELTA directo), se lanza ConflictException.</w:t>
+      </w:r>
+    </w:p>
+    <w:p>
+      <w:pPr>
+        <w:pStyle w:val="Prrafodelista"/>
+        <w:numPr>
+          <w:ilvl w:val="0"/>
+          <w:numId w:val="3"/>
+        </w:numPr>
+        <w:spacing w:after="60"/>
+      </w:pPr>
+      <w:r>
+        <w:rPr>
+          <w:sz w:val="19"/>
+          <w:szCs w:val="19"/>
+        </w:rPr>
+        <w:t xml:space="preserve">ConflictException ya existía en el proyecto y el GlobalExceptionHandler ya la convertía en HTTP 409 con el mensaje — no fue necesario crear ningún mecanismo nuevo de manejo de errores.</w:t>
+      </w:r>
+    </w:p>
+    <w:p>
+      <w:pPr>
+        <w:pStyle w:val="Prrafodelista"/>
+        <w:numPr>
+          <w:ilvl w:val="0"/>
+          <w:numId w:val="3"/>
+        </w:numPr>
+        <w:spacing w:after="60"/>
+      </w:pPr>
+      <w:r>
+        <w:rPr>
+          <w:sz w:val="19"/>
+          <w:szCs w:val="19"/>
+        </w:rPr>
+        <w:t xml:space="preserve">Guardar el mismo estado que ya tenía la vulnerabilidad (por ejemplo al editar solo el responsable o la decisión desde el modal, sin cambiar el estado) se sigue permitiendo: no se trata como una transición.</w:t>
+      </w:r>
+    </w:p>
+    <w:p>
+      <w:pPr>
+        <w:pStyle w:val="Prrafodelista"/>
+        <w:numPr>
+          <w:ilvl w:val="0"/>
+          <w:numId w:val="3"/>
+        </w:numPr>
+        <w:spacing w:after="60"/>
+      </w:pPr>
+      <w:r>
+        <w:rPr>
+          <w:sz w:val="19"/>
+          <w:szCs w:val="19"/>
+        </w:rPr>
+        <w:t xml:space="preserve">Frontend: el catch del drag-and-drop del Kanban (onDragEnd) y el del guardado desde el modal (handleSave) ahora muestran el mensaje real que devuelve el backend (err.message) en vez de un texto genérico, aprovechando que el interceptor de axios en services/api.ts ya extraía err.response.data.message.</w:t>
+      </w:r>
+    </w:p>
+    <w:p>
+      <w:pPr>
+        <w:spacing w:before="200" w:after="80"/>
+      </w:pPr>
+      <w:r>
+        <w:rPr>
+          <w:b/>
+          <w:bCs/>
+          <w:color w:val="4F46E5"/>
+        </w:rPr>
+        <w:t>Verificación</w:t>
+      </w:r>
+    </w:p>
+    <w:p>
+      <w:pPr>
+        <w:spacing w:after="120"/>
+      </w:pPr>
+      <w:r>
+        <w:rPr>
+          <w:sz w:val="19"/>
+          <w:szCs w:val="19"/>
+        </w:rPr>
+        <w:t xml:space="preserve">Probado en ambiente local (Docker Compose): arrastrar una tarjeta de "Detectada" directo a "Resuelta" rebota a su columna original y muestra el toast con el mensaje de transición no permitida. Los caminos válidos (Detectada → En análisis, En análisis → Resuelta, En análisis → Detectada, Resuelta → En análisis) se probaron uno por uno y funcionan correctamente. Cambios pendientes de subir a origin/main.</w:t>
+      </w:r>
+    </w:p>
+    <w:p>
+      <w:pPr>
+        <w:spacing w:before="200" w:after="80"/>
+      </w:pPr>
+      <w:r>
+        <w:rPr>
+          <w:b/>
+          <w:bCs/>
+          <w:color w:val="4F46E5"/>
+        </w:rPr>
+        <w:t>Pendiente / observaciones</w:t>
       </w:r>
     </w:p>
     <w:p>
@@ -1811,13 +1225,10 @@
       </w:pPr>
       <w:r>
         <w:rPr>
-          <w:i/>
-          <w:iCs/>
-          <w:color w:val="94A3B8"/>
-          <w:sz w:val="19"/>
-          <w:szCs w:val="19"/>
-        </w:rPr>
-        <w:t>(completar al iniciar esta sección)</w:t>
+          <w:sz w:val="19"/>
+          <w:szCs w:val="19"/>
+        </w:rPr>
+        <w:t xml:space="preserve">Con esta sección resuelta, el cálculo de MTTR de la Sección 1 pasa a ser confiable: ya no se puede saltear "En análisis" al marcar una vulnerabilidad como resuelta, que era la limitación que Guadalupe había dejado anotada. También queda resuelto un bug lateral detectado durante las pruebas: el filtro de fecha del Kanban arrancaba en la fecha de hoy (ver Sección 4).</w:t>
       </w:r>
     </w:p>
     <w:p>
@@ -2013,16 +1424,8 @@
         <w:rPr>
           <w:color w:val="1E1B4B"/>
         </w:rPr>
-        <w:t xml:space="preserve">Sección 4 — Corrección del filtro de fecha por defecto en el </w:t>
-      </w:r>
-      <w:proofErr w:type="spellStart"/>
-      <w:r>
-        <w:rPr>
-          <w:color w:val="1E1B4B"/>
-        </w:rPr>
-        <w:t>Kanban</w:t>
-      </w:r>
-      <w:proofErr w:type="spellEnd"/>
+        <w:t xml:space="preserve">Sección 4 — Corrección del filtro de fecha por defecto en el Kanban</w:t>
+      </w:r>
     </w:p>
     <w:tbl>
       <w:tblPr>
@@ -2100,7 +1503,16 @@
               <w:right w:w="120" w:type="dxa"/>
             </w:tcMar>
           </w:tcPr>
-          <w:p/>
+          <w:p>
+            <w:r>
+              <w:rPr>
+                <w:color w:val="0F172A"/>
+                <w:sz w:val="19"/>
+                <w:szCs w:val="19"/>
+              </w:rPr>
+              <w:t>Emilia Barros</w:t>
+            </w:r>
+          </w:p>
         </w:tc>
         <w:tc>
           <w:tcPr>
@@ -2155,7 +1567,7 @@
                 <w:sz w:val="19"/>
                 <w:szCs w:val="19"/>
               </w:rPr>
-              <w:t>PENDIENTE</w:t>
+              <w:t>FINALIZADO</w:t>
             </w:r>
           </w:p>
         </w:tc>
@@ -2163,7 +1575,7 @@
     </w:tbl>
     <w:p>
       <w:pPr>
-        <w:spacing w:before="160" w:after="60"/>
+        <w:spacing w:before="120"/>
       </w:pPr>
       <w:r>
         <w:rPr>
@@ -2172,7 +1584,156 @@
           <w:sz w:val="19"/>
           <w:szCs w:val="19"/>
         </w:rPr>
-        <w:t xml:space="preserve">Cambios realizados: </w:t>
+        <w:t xml:space="preserve">Fecha: </w:t>
+      </w:r>
+      <w:r>
+        <w:rPr>
+          <w:sz w:val="19"/>
+          <w:szCs w:val="19"/>
+        </w:rPr>
+        <w:t>04/08/2026</w:t>
+      </w:r>
+    </w:p>
+    <w:p>
+      <w:pPr>
+        <w:spacing w:before="200" w:after="80"/>
+      </w:pPr>
+      <w:r>
+        <w:rPr>
+          <w:b/>
+          <w:bCs/>
+          <w:color w:val="4F46E5"/>
+        </w:rPr>
+        <w:t>Resumen</w:t>
+      </w:r>
+    </w:p>
+    <w:p>
+      <w:pPr>
+        <w:spacing w:after="120"/>
+      </w:pPr>
+      <w:r>
+        <w:rPr>
+          <w:sz w:val="19"/>
+          <w:szCs w:val="19"/>
+        </w:rPr>
+        <w:t xml:space="preserve">El filtro de fecha del Kanban arrancaba con el valor de hoy en vez de vacío, por lo que el tablero se veía vacío al abrirlo hasta que alguien tocara el filtro manualmente.</w:t>
+      </w:r>
+    </w:p>
+    <w:p>
+      <w:pPr>
+        <w:spacing w:before="200" w:after="80"/>
+      </w:pPr>
+      <w:r>
+        <w:rPr>
+          <w:b/>
+          <w:bCs/>
+          <w:color w:val="4F46E5"/>
+        </w:rPr>
+        <w:t>Archivos modificados</w:t>
+      </w:r>
+    </w:p>
+    <w:p>
+      <w:pPr>
+        <w:pStyle w:val="Prrafodelista"/>
+        <w:numPr>
+          <w:ilvl w:val="0"/>
+          <w:numId w:val="2"/>
+        </w:numPr>
+        <w:spacing w:after="40"/>
+      </w:pPr>
+      <w:r>
+        <w:rPr>
+          <w:rFonts w:ascii="Consolas" w:eastAsia="Consolas" w:hAnsi="Consolas" w:cs="Consolas"/>
+          <w:color w:val="475569"/>
+          <w:sz w:val="18"/>
+          <w:szCs w:val="18"/>
+        </w:rPr>
+        <w:t>frontend/src/pages/Kanban.tsx</w:t>
+      </w:r>
+    </w:p>
+    <w:p>
+      <w:pPr>
+        <w:spacing w:before="200" w:after="80"/>
+      </w:pPr>
+      <w:r>
+        <w:rPr>
+          <w:b/>
+          <w:bCs/>
+          <w:color w:val="4F46E5"/>
+        </w:rPr>
+        <w:t>Cambios realizados</w:t>
+      </w:r>
+    </w:p>
+    <w:p>
+      <w:pPr>
+        <w:pStyle w:val="Prrafodelista"/>
+        <w:numPr>
+          <w:ilvl w:val="0"/>
+          <w:numId w:val="3"/>
+        </w:numPr>
+        <w:spacing w:after="60"/>
+      </w:pPr>
+      <w:r>
+        <w:rPr>
+          <w:sz w:val="19"/>
+          <w:szCs w:val="19"/>
+        </w:rPr>
+        <w:t xml:space="preserve">Se cambió el valor inicial de filterDate de new Date().toLocaleDateString('en-CA') a una cadena vacía ''.</w:t>
+      </w:r>
+    </w:p>
+    <w:p>
+      <w:pPr>
+        <w:pStyle w:val="Prrafodelista"/>
+        <w:numPr>
+          <w:ilvl w:val="0"/>
+          <w:numId w:val="3"/>
+        </w:numPr>
+        <w:spacing w:after="60"/>
+      </w:pPr>
+      <w:r>
+        <w:rPr>
+          <w:sz w:val="19"/>
+          <w:szCs w:val="19"/>
+        </w:rPr>
+        <w:t xml:space="preserve">No fue necesario modificar la lógica de filtrado: el código ya contemplaba que un filtro de fecha vacío significa "mostrar todas las vulnerabilidades sin filtrar por fecha" (const matchDate = filterDate ? dateValue.startsWith(filterDate) : true).</w:t>
+      </w:r>
+    </w:p>
+    <w:p>
+      <w:pPr>
+        <w:spacing w:before="200" w:after="80"/>
+      </w:pPr>
+      <w:r>
+        <w:rPr>
+          <w:b/>
+          <w:bCs/>
+          <w:color w:val="4F46E5"/>
+        </w:rPr>
+        <w:t>Verificación</w:t>
+      </w:r>
+    </w:p>
+    <w:p>
+      <w:pPr>
+        <w:spacing w:after="120"/>
+      </w:pPr>
+      <w:r>
+        <w:rPr>
+          <w:sz w:val="19"/>
+          <w:szCs w:val="19"/>
+        </w:rPr>
+        <w:t xml:space="preserve">Probado en ambiente local (Docker Compose): al recargar el Kanban, las 9 vulnerabilidades de los datos de ejemplo aparecen distribuidas en sus columnas (3 Detectadas, 2 En Análisis, 4 Resueltas) sin tocar ningún filtro. Cambios pendientes de subir a origin/main.</w:t>
+      </w:r>
+    </w:p>
+    <w:p>
+      <w:pPr>
+        <w:spacing w:before="200" w:after="80"/>
+      </w:pPr>
+      <w:r>
+        <w:rPr>
+          <w:b/>
+          <w:bCs/>
+          <w:color w:val="4F46E5"/>
+        </w:rPr>
+        <w:t>Pendiente / observaciones</w:t>
       </w:r>
     </w:p>
     <w:p>
@@ -2181,13 +1742,10 @@
       </w:pPr>
       <w:r>
         <w:rPr>
-          <w:i/>
-          <w:iCs/>
-          <w:color w:val="94A3B8"/>
-          <w:sz w:val="19"/>
-          <w:szCs w:val="19"/>
-        </w:rPr>
-        <w:t>(completar al iniciar esta sección)</w:t>
+          <w:sz w:val="19"/>
+          <w:szCs w:val="19"/>
+        </w:rPr>
+        <w:t xml:space="preserve">Ninguna.</w:t>
       </w:r>
     </w:p>
     <w:p>
@@ -2746,16 +2304,8 @@
         <w:rPr>
           <w:color w:val="1E1B4B"/>
         </w:rPr>
-        <w:t xml:space="preserve">Sección 8 — Corrección de tipos de prioridad en el </w:t>
-      </w:r>
-      <w:proofErr w:type="spellStart"/>
-      <w:r>
-        <w:rPr>
-          <w:color w:val="1E1B4B"/>
-        </w:rPr>
-        <w:t>frontend</w:t>
-      </w:r>
-      <w:proofErr w:type="spellEnd"/>
+        <w:t xml:space="preserve">Sección 8 — Corrección de tipos de prioridad en el frontend</w:t>
+      </w:r>
     </w:p>
     <w:tbl>
       <w:tblPr>
@@ -3116,21 +2666,7 @@
         <w:rPr>
           <w:color w:val="1E1B4B"/>
         </w:rPr>
-        <w:t xml:space="preserve">Sección 10 — </w:t>
-      </w:r>
-      <w:proofErr w:type="spellStart"/>
-      <w:r>
-        <w:rPr>
-          <w:color w:val="1E1B4B"/>
-        </w:rPr>
-        <w:t>Dashboard</w:t>
-      </w:r>
-      <w:proofErr w:type="spellEnd"/>
-      <w:r>
-        <w:rPr>
-          <w:color w:val="1E1B4B"/>
-        </w:rPr>
-        <w:t>: nuevos indicadores y alertas (KEV, variación semanal, banner, progreso)</w:t>
+        <w:t xml:space="preserve">Sección 10 — Dashboard: nuevos indicadores y alertas (KEV, variación semanal, banner, progreso)</w:t>
       </w:r>
     </w:p>
     <w:tbl>
@@ -3492,21 +3028,7 @@
         <w:rPr>
           <w:color w:val="1E1B4B"/>
         </w:rPr>
-        <w:t>Sección 12 — Gestión de falsos positivos (</w:t>
-      </w:r>
-      <w:proofErr w:type="spellStart"/>
-      <w:r>
-        <w:rPr>
-          <w:color w:val="1E1B4B"/>
-        </w:rPr>
-        <w:t>whitelist</w:t>
-      </w:r>
-      <w:proofErr w:type="spellEnd"/>
-      <w:r>
-        <w:rPr>
-          <w:color w:val="1E1B4B"/>
-        </w:rPr>
-        <w:t>)</w:t>
+        <w:t>Sección 12 — Gestión de falsos positivos (whitelist)</w:t>
       </w:r>
     </w:p>
     <w:tbl>
@@ -7130,16 +6652,8 @@
           <w:color w:val="1E1B4B"/>
         </w:rPr>
         <w:lastRenderedPageBreak/>
-        <w:t xml:space="preserve">Sección 32 — Selector de rango de tiempo para todo el </w:t>
-      </w:r>
-      <w:proofErr w:type="spellStart"/>
-      <w:r>
-        <w:rPr>
-          <w:color w:val="1E1B4B"/>
-        </w:rPr>
-        <w:t>Dashboard</w:t>
-      </w:r>
-      <w:proofErr w:type="spellEnd"/>
+        <w:t xml:space="preserve">Sección 32 — Selector de rango de tiempo para todo el Dashboard</w:t>
+      </w:r>
     </w:p>
     <w:tbl>
       <w:tblPr>
@@ -7319,16 +6833,8 @@
         <w:rPr>
           <w:color w:val="1E1B4B"/>
         </w:rPr>
-        <w:t>Sección 33 — Gráficos interactivos con drill-</w:t>
-      </w:r>
-      <w:proofErr w:type="spellStart"/>
-      <w:r>
-        <w:rPr>
-          <w:color w:val="1E1B4B"/>
-        </w:rPr>
-        <w:t>down</w:t>
-      </w:r>
-      <w:proofErr w:type="spellEnd"/>
+        <w:t>Sección 33 — Gráficos interactivos con drill-down</w:t>
+      </w:r>
     </w:p>
     <w:tbl>
       <w:tblPr>
@@ -7508,30 +7014,8 @@
         <w:rPr>
           <w:color w:val="1E1B4B"/>
         </w:rPr>
-        <w:t xml:space="preserve">Sección 34 — Caché del </w:t>
-      </w:r>
-      <w:proofErr w:type="spellStart"/>
-      <w:r>
-        <w:rPr>
-          <w:color w:val="1E1B4B"/>
-        </w:rPr>
-        <w:t>Dashboard</w:t>
-      </w:r>
-      <w:proofErr w:type="spellEnd"/>
-      <w:r>
-        <w:rPr>
-          <w:color w:val="1E1B4B"/>
-        </w:rPr>
-        <w:t xml:space="preserve"> con </w:t>
-      </w:r>
-      <w:proofErr w:type="spellStart"/>
-      <w:r>
-        <w:rPr>
-          <w:color w:val="1E1B4B"/>
-        </w:rPr>
-        <w:t>Caffeine</w:t>
-      </w:r>
-      <w:proofErr w:type="spellEnd"/>
+        <w:t xml:space="preserve">Sección 34 — Caché del Dashboard con Caffeine</w:t>
+      </w:r>
     </w:p>
     <w:tbl>
       <w:tblPr>
@@ -7711,16 +7195,8 @@
         <w:rPr>
           <w:color w:val="1E1B4B"/>
         </w:rPr>
-        <w:t xml:space="preserve">Sección 35 — Auto-actualización periódica del </w:t>
-      </w:r>
-      <w:proofErr w:type="spellStart"/>
-      <w:r>
-        <w:rPr>
-          <w:color w:val="1E1B4B"/>
-        </w:rPr>
-        <w:t>Dashboard</w:t>
-      </w:r>
-      <w:proofErr w:type="spellEnd"/>
+        <w:t xml:space="preserve">Sección 35 — Auto-actualización periódica del Dashboard</w:t>
+      </w:r>
     </w:p>
     <w:tbl>
       <w:tblPr>
@@ -8081,16 +7557,8 @@
         <w:rPr>
           <w:color w:val="1E1B4B"/>
         </w:rPr>
-        <w:t xml:space="preserve">Sección 37 — Mejoras visuales del </w:t>
-      </w:r>
-      <w:proofErr w:type="spellStart"/>
-      <w:r>
-        <w:rPr>
-          <w:color w:val="1E1B4B"/>
-        </w:rPr>
-        <w:t>Kanban</w:t>
-      </w:r>
-      <w:proofErr w:type="spellEnd"/>
+        <w:t xml:space="preserve">Sección 37 — Mejoras visuales del Kanban</w:t>
+      </w:r>
     </w:p>
     <w:tbl>
       <w:tblPr>
@@ -8270,21 +7738,7 @@
         <w:rPr>
           <w:color w:val="1E1B4B"/>
         </w:rPr>
-        <w:t xml:space="preserve">Sección 38 — </w:t>
-      </w:r>
-      <w:proofErr w:type="spellStart"/>
-      <w:r>
-        <w:rPr>
-          <w:color w:val="1E1B4B"/>
-        </w:rPr>
-        <w:t>Sidebar</w:t>
-      </w:r>
-      <w:proofErr w:type="spellEnd"/>
-      <w:r>
-        <w:rPr>
-          <w:color w:val="1E1B4B"/>
-        </w:rPr>
-        <w:t xml:space="preserve"> y navegación</w:t>
+        <w:t xml:space="preserve">Sección 38 — Sidebar y navegación</w:t>
       </w:r>
     </w:p>
     <w:tbl>

</xml_diff>